<commit_message>
config new more real implementation
</commit_message>
<xml_diff>
--- a/report_architettura_simulazione_migrazioni_hot_cold.docx
+++ b/report_architettura_simulazione_migrazioni_hot_cold.docx
@@ -1962,14 +1962,7 @@
     </w:p>
     <w:p>
       <w:r>
-        <w:rPr>
-          <w:rFonts w:ascii="Aptos" w:hAnsi="Aptos"/>
-          <w:b w:val="0"/>
-          <w:i w:val="0"/>
-          <w:color w:val="000000"/>
-          <w:sz w:val="21"/>
-        </w:rPr>
-        <w:t>Con i parametri predefiniti il trigger è 60 secondi di allineamento + 90 secondi di budget di esecuzione + 60 secondi di margine: 210 secondi. Il target deve inoltre avere luce residua almeno pari al massimo fra la soglia minima configurata e il trigger. Sono scartati target fuori portata o con occultazione terrestre.</w:t>
+        <w:t>Con i parametri predefiniti il trigger è 60 secondi di allineamento + 90 secondi di budget di esecuzione + 60 secondi di margine: 210 secondi. Il target deve inoltre avere luce residua almeno pari al massimo fra la soglia minima configurata e il trigger. Sono scartati target oltre la portata nominale di 1.700 km o con occultazione terrestre. Il valore è un parametro modellistico informato da uno scenario LISL studiato per Starlink Phase I [1], non una specifica certificata di un terminale Starlink.</w:t>
       </w:r>
     </w:p>
     <w:p>
@@ -6012,6 +6005,19 @@
         <w:t>In sintesi, la simulazione separa chiaramente la fisica del collegamento, la politica di scelta e la transazione di migrazione. La Hot riduce la parte dell'operazione eseguita durante l'interruzione grazie alla pre-copy e alla verifica del delta finale; la Cold privilegia un singolo checkpoint congelato, pagando il trasferimento completo dopo lo stop. Il sequence number, l'ACK esplicito, la deadline e il rollback sono le barriere che impediscono di trasformare una perdita di contatto o una risposta incompleta in un cambio host inconsistente.</w:t>
       </w:r>
     </w:p>
+    <w:p>
+      <w:pPr>
+        <w:pStyle w:val="Heading1"/>
+      </w:pPr>
+      <w:r>
+        <w:t>Riferimenti</w:t>
+      </w:r>
+    </w:p>
+    <w:p>
+      <w:r>
+        <w:t>[1] A. U. Chaudhry and H. Yanikomeroglu, “Temporary Laser Inter-Satellite Links in Free-Space Optical Satellite Networks,” IEEE Open Journal of the Communications Society, vol. 3, pp. 1413–1427, 2022. DOI: 10.1109/OJCOMS.2022.3198391.</w:t>
+      </w:r>
+    </w:p>
     <w:sectPr>
       <w:footerReference w:type="default" r:id="rId9"/>
       <w:pgSz w:w="12240" w:h="15840"/>

</xml_diff>